<commit_message>
docs: improve lab 1 answers
</commit_message>
<xml_diff>
--- a/docs/ABD Práctica 1 - Laboratorio 1 - Git Fundamentals.docx
+++ b/docs/ABD Práctica 1 - Laboratorio 1 - Git Fundamentals.docx
@@ -12,6 +12,7 @@
       </w:pPr>
       <w:r>
         <w:rPr>
+          <w:noProof/>
           <w:sz w:val="56"/>
           <w:szCs w:val="56"/>
         </w:rPr>
@@ -423,24 +424,417 @@
         <w:rPr>
           <w:color w:val="45B0E1" w:themeColor="accent1" w:themeTint="99"/>
         </w:rPr>
-        <w:t>? Da un ejemplo de un</w:t>
-      </w:r>
-      <w:r>
-        <w:rPr>
-          <w:color w:val="45B0E1" w:themeColor="accent1" w:themeTint="99"/>
-        </w:rPr>
+        <w:t>? Da un ejemplo de un archivo pasando por las tres.</w:t>
+      </w:r>
+    </w:p>
+    <w:p>
+      <w:r>
+        <w:t xml:space="preserve"> El </w:t>
+      </w:r>
+      <w:proofErr w:type="spellStart"/>
+      <w:r>
+        <w:t>working</w:t>
+      </w:r>
+      <w:proofErr w:type="spellEnd"/>
+      <w:r>
         <w:t xml:space="preserve"> </w:t>
       </w:r>
-      <w:r>
-        <w:rPr>
-          <w:color w:val="45B0E1" w:themeColor="accent1" w:themeTint="99"/>
-        </w:rPr>
-        <w:t>archivo pasando por las tres.</w:t>
-      </w:r>
-    </w:p>
-    <w:p>
-      <w:r>
-        <w:t xml:space="preserve"> El </w:t>
+      <w:proofErr w:type="spellStart"/>
+      <w:r>
+        <w:t>directory</w:t>
+      </w:r>
+      <w:proofErr w:type="spellEnd"/>
+      <w:r>
+        <w:t xml:space="preserve"> es la carpeta del proyecto donde tengo todos los archivos y los voy </w:t>
+      </w:r>
+      <w:proofErr w:type="gramStart"/>
+      <w:r>
+        <w:t>cambiando .</w:t>
+      </w:r>
+      <w:proofErr w:type="gramEnd"/>
+      <w:r>
+        <w:t xml:space="preserve"> La </w:t>
+      </w:r>
+      <w:proofErr w:type="spellStart"/>
+      <w:r>
+        <w:t>Staging</w:t>
+      </w:r>
+      <w:proofErr w:type="spellEnd"/>
+      <w:r>
+        <w:t xml:space="preserve"> </w:t>
+      </w:r>
+      <w:proofErr w:type="spellStart"/>
+      <w:r>
+        <w:t>Area</w:t>
+      </w:r>
+      <w:proofErr w:type="spellEnd"/>
+      <w:r>
+        <w:t xml:space="preserve"> es como la zona intermedia donde pongo los cambios para el próximo </w:t>
+      </w:r>
+      <w:proofErr w:type="spellStart"/>
+      <w:proofErr w:type="gramStart"/>
+      <w:r>
+        <w:t>commit</w:t>
+      </w:r>
+      <w:proofErr w:type="spellEnd"/>
+      <w:r>
+        <w:t xml:space="preserve"> .</w:t>
+      </w:r>
+      <w:proofErr w:type="gramEnd"/>
+      <w:r>
+        <w:t xml:space="preserve"> Y la Local </w:t>
+      </w:r>
+      <w:proofErr w:type="spellStart"/>
+      <w:r>
+        <w:t>Repository</w:t>
+      </w:r>
+      <w:proofErr w:type="spellEnd"/>
+      <w:r>
+        <w:t xml:space="preserve"> es donde se guardan los </w:t>
+      </w:r>
+      <w:proofErr w:type="spellStart"/>
+      <w:r>
+        <w:t>commits</w:t>
+      </w:r>
+      <w:proofErr w:type="spellEnd"/>
+      <w:r>
+        <w:t xml:space="preserve"> ya hechos.</w:t>
+      </w:r>
+    </w:p>
+    <w:p>
+      <w:r>
+        <w:t xml:space="preserve">Por ejemplo: Modifico README.md lo que es Working </w:t>
+      </w:r>
+      <w:proofErr w:type="spellStart"/>
+      <w:r>
+        <w:t>Directory</w:t>
+      </w:r>
+      <w:proofErr w:type="spellEnd"/>
+      <w:r>
+        <w:t xml:space="preserve">, luego hago </w:t>
+      </w:r>
+      <w:proofErr w:type="gramStart"/>
+      <w:r>
+        <w:t xml:space="preserve">( </w:t>
+      </w:r>
+      <w:proofErr w:type="spellStart"/>
+      <w:r>
+        <w:t>git</w:t>
+      </w:r>
+      <w:proofErr w:type="spellEnd"/>
+      <w:proofErr w:type="gramEnd"/>
+      <w:r>
+        <w:t xml:space="preserve"> </w:t>
+      </w:r>
+      <w:proofErr w:type="spellStart"/>
+      <w:r>
+        <w:t>add</w:t>
+      </w:r>
+      <w:proofErr w:type="spellEnd"/>
+      <w:r>
+        <w:t xml:space="preserve"> README.md) y pasa al </w:t>
+      </w:r>
+      <w:proofErr w:type="spellStart"/>
+      <w:r>
+        <w:t>Sta</w:t>
+      </w:r>
+      <w:r>
+        <w:t>g</w:t>
+      </w:r>
+      <w:r>
+        <w:t>ing</w:t>
+      </w:r>
+      <w:proofErr w:type="spellEnd"/>
+      <w:r>
+        <w:t xml:space="preserve"> </w:t>
+      </w:r>
+      <w:proofErr w:type="spellStart"/>
+      <w:r>
+        <w:t>Area</w:t>
+      </w:r>
+      <w:proofErr w:type="spellEnd"/>
+      <w:r>
+        <w:t xml:space="preserve"> y por último con (</w:t>
+      </w:r>
+      <w:proofErr w:type="spellStart"/>
+      <w:r>
+        <w:t>git</w:t>
+      </w:r>
+      <w:proofErr w:type="spellEnd"/>
+      <w:r>
+        <w:t xml:space="preserve"> </w:t>
+      </w:r>
+      <w:proofErr w:type="spellStart"/>
+      <w:r>
+        <w:t>commit</w:t>
+      </w:r>
+      <w:proofErr w:type="spellEnd"/>
+      <w:r>
+        <w:t xml:space="preserve">) se guarda en el historial. </w:t>
+      </w:r>
+    </w:p>
+    <w:p>
+      <w:pPr>
+        <w:rPr>
+          <w:color w:val="45B0E1" w:themeColor="accent1" w:themeTint="99"/>
+        </w:rPr>
+      </w:pPr>
+      <w:r>
+        <w:rPr>
+          <w:color w:val="45B0E1" w:themeColor="accent1" w:themeTint="99"/>
+        </w:rPr>
+        <w:t xml:space="preserve">2. Si modificas un </w:t>
+      </w:r>
+      <w:proofErr w:type="gramStart"/>
+      <w:r>
+        <w:rPr>
+          <w:color w:val="45B0E1" w:themeColor="accent1" w:themeTint="99"/>
+        </w:rPr>
+        <w:t>archivo</w:t>
+      </w:r>
+      <w:proofErr w:type="gramEnd"/>
+      <w:r>
+        <w:rPr>
+          <w:color w:val="45B0E1" w:themeColor="accent1" w:themeTint="99"/>
+        </w:rPr>
+        <w:t xml:space="preserve"> pero no haces </w:t>
+      </w:r>
+      <w:proofErr w:type="spellStart"/>
+      <w:r>
+        <w:rPr>
+          <w:color w:val="45B0E1" w:themeColor="accent1" w:themeTint="99"/>
+        </w:rPr>
+        <w:t>git</w:t>
+      </w:r>
+      <w:proofErr w:type="spellEnd"/>
+      <w:r>
+        <w:rPr>
+          <w:color w:val="45B0E1" w:themeColor="accent1" w:themeTint="99"/>
+        </w:rPr>
+        <w:t xml:space="preserve"> </w:t>
+      </w:r>
+      <w:proofErr w:type="spellStart"/>
+      <w:r>
+        <w:rPr>
+          <w:color w:val="45B0E1" w:themeColor="accent1" w:themeTint="99"/>
+        </w:rPr>
+        <w:t>add</w:t>
+      </w:r>
+      <w:proofErr w:type="spellEnd"/>
+      <w:r>
+        <w:rPr>
+          <w:color w:val="45B0E1" w:themeColor="accent1" w:themeTint="99"/>
+        </w:rPr>
+        <w:t xml:space="preserve">, ¿aparece ese cambio en tu próximo </w:t>
+      </w:r>
+      <w:proofErr w:type="spellStart"/>
+      <w:r>
+        <w:rPr>
+          <w:color w:val="45B0E1" w:themeColor="accent1" w:themeTint="99"/>
+        </w:rPr>
+        <w:t>commit</w:t>
+      </w:r>
+      <w:proofErr w:type="spellEnd"/>
+      <w:r>
+        <w:rPr>
+          <w:color w:val="45B0E1" w:themeColor="accent1" w:themeTint="99"/>
+        </w:rPr>
+        <w:t xml:space="preserve">? Explica </w:t>
+      </w:r>
+      <w:proofErr w:type="spellStart"/>
+      <w:r>
+        <w:rPr>
+          <w:color w:val="45B0E1" w:themeColor="accent1" w:themeTint="99"/>
+        </w:rPr>
+        <w:t>porqué</w:t>
+      </w:r>
+      <w:proofErr w:type="spellEnd"/>
+      <w:r>
+        <w:rPr>
+          <w:color w:val="45B0E1" w:themeColor="accent1" w:themeTint="99"/>
+        </w:rPr>
+        <w:t>.</w:t>
+      </w:r>
+    </w:p>
+    <w:p>
+      <w:r>
+        <w:t>No</w:t>
+      </w:r>
+      <w:r>
+        <w:t xml:space="preserve">, </w:t>
+      </w:r>
+      <w:r>
+        <w:t xml:space="preserve">sino hago </w:t>
+      </w:r>
+      <w:proofErr w:type="spellStart"/>
+      <w:r>
+        <w:t>git</w:t>
+      </w:r>
+      <w:proofErr w:type="spellEnd"/>
+      <w:r>
+        <w:t xml:space="preserve"> </w:t>
+      </w:r>
+      <w:proofErr w:type="spellStart"/>
+      <w:r>
+        <w:t>add</w:t>
+      </w:r>
+      <w:proofErr w:type="spellEnd"/>
+      <w:r>
+        <w:t>, no</w:t>
+      </w:r>
+      <w:r>
+        <w:t xml:space="preserve"> aparece en el </w:t>
+      </w:r>
+      <w:proofErr w:type="spellStart"/>
+      <w:r>
+        <w:t>commit</w:t>
+      </w:r>
+      <w:proofErr w:type="spellEnd"/>
+      <w:r>
+        <w:t xml:space="preserve">, ya </w:t>
+      </w:r>
+      <w:r>
+        <w:t xml:space="preserve">que no permitimos que pase del </w:t>
+      </w:r>
+      <w:proofErr w:type="spellStart"/>
+      <w:r>
+        <w:t>Sta</w:t>
+      </w:r>
+      <w:r>
+        <w:t>g</w:t>
+      </w:r>
+      <w:r>
+        <w:t>ing</w:t>
+      </w:r>
+      <w:proofErr w:type="spellEnd"/>
+      <w:r>
+        <w:t xml:space="preserve"> </w:t>
+      </w:r>
+      <w:proofErr w:type="spellStart"/>
+      <w:r>
+        <w:t>Area</w:t>
+      </w:r>
+      <w:proofErr w:type="spellEnd"/>
+      <w:r>
+        <w:t xml:space="preserve"> Local </w:t>
+      </w:r>
+      <w:proofErr w:type="spellStart"/>
+      <w:r>
+        <w:t>Repository</w:t>
+      </w:r>
+      <w:proofErr w:type="spellEnd"/>
+    </w:p>
+    <w:p>
+      <w:pPr>
+        <w:rPr>
+          <w:color w:val="45B0E1" w:themeColor="accent1" w:themeTint="99"/>
+        </w:rPr>
+      </w:pPr>
+      <w:r>
+        <w:rPr>
+          <w:color w:val="45B0E1" w:themeColor="accent1" w:themeTint="99"/>
+        </w:rPr>
+        <w:t xml:space="preserve">3. ¿Por qué </w:t>
+      </w:r>
+      <w:proofErr w:type="spellStart"/>
+      <w:r>
+        <w:rPr>
+          <w:color w:val="45B0E1" w:themeColor="accent1" w:themeTint="99"/>
+        </w:rPr>
+        <w:t>git</w:t>
+      </w:r>
+      <w:proofErr w:type="spellEnd"/>
+      <w:r>
+        <w:rPr>
+          <w:color w:val="45B0E1" w:themeColor="accent1" w:themeTint="99"/>
+        </w:rPr>
+        <w:t xml:space="preserve"> </w:t>
+      </w:r>
+      <w:proofErr w:type="gramStart"/>
+      <w:r>
+        <w:rPr>
+          <w:color w:val="45B0E1" w:themeColor="accent1" w:themeTint="99"/>
+        </w:rPr>
+        <w:t>status</w:t>
+      </w:r>
+      <w:proofErr w:type="gramEnd"/>
+      <w:r>
+        <w:rPr>
+          <w:color w:val="45B0E1" w:themeColor="accent1" w:themeTint="99"/>
+        </w:rPr>
+        <w:t xml:space="preserve"> no mostraba las carpetas vacías que creaste en la Parte C? ¿Qué truco usamos para</w:t>
+      </w:r>
+      <w:r>
+        <w:rPr>
+          <w:color w:val="45B0E1" w:themeColor="accent1" w:themeTint="99"/>
+        </w:rPr>
+        <w:t xml:space="preserve"> </w:t>
+      </w:r>
+      <w:r>
+        <w:rPr>
+          <w:color w:val="45B0E1" w:themeColor="accent1" w:themeTint="99"/>
+        </w:rPr>
+        <w:t>solucionarlo?</w:t>
+      </w:r>
+    </w:p>
+    <w:p>
+      <w:r>
+        <w:t xml:space="preserve">Porque </w:t>
+      </w:r>
+      <w:proofErr w:type="spellStart"/>
+      <w:r>
+        <w:t>git</w:t>
+      </w:r>
+      <w:proofErr w:type="spellEnd"/>
+      <w:r>
+        <w:t xml:space="preserve"> no guarda capetas vacías, sino archivos.  Para solucionarlo guardamos dentro de estas carpetas archivos </w:t>
+      </w:r>
+      <w:proofErr w:type="gramStart"/>
+      <w:r>
+        <w:t>llamados .</w:t>
+      </w:r>
+      <w:proofErr w:type="spellStart"/>
+      <w:r>
+        <w:t>gitkeep</w:t>
+      </w:r>
+      <w:proofErr w:type="spellEnd"/>
+      <w:proofErr w:type="gramEnd"/>
+      <w:r>
+        <w:t xml:space="preserve">, así ya se guardaba algo dentro de estas carpetas. </w:t>
+      </w:r>
+    </w:p>
+    <w:p>
+      <w:pPr>
+        <w:rPr>
+          <w:color w:val="45B0E1" w:themeColor="accent1" w:themeTint="99"/>
+        </w:rPr>
+      </w:pPr>
+      <w:r>
+        <w:rPr>
+          <w:color w:val="45B0E1" w:themeColor="accent1" w:themeTint="99"/>
+        </w:rPr>
+        <w:t>4. Explica con tus palabras qué es HEAD.</w:t>
+      </w:r>
+    </w:p>
+    <w:p>
+      <w:r>
+        <w:t xml:space="preserve">- HEAD es la referencia que indica en qué </w:t>
+      </w:r>
+      <w:proofErr w:type="spellStart"/>
+      <w:r>
+        <w:t>commit</w:t>
+      </w:r>
+      <w:proofErr w:type="spellEnd"/>
+      <w:r>
+        <w:t xml:space="preserve"> o rama estoy trabajando en ese momento. Cuando cambio de </w:t>
+      </w:r>
+      <w:proofErr w:type="spellStart"/>
+      <w:r>
+        <w:t>branch</w:t>
+      </w:r>
+      <w:proofErr w:type="spellEnd"/>
+      <w:r>
+        <w:t xml:space="preserve">, HEAD cambia y Git adapta los archivos del </w:t>
       </w:r>
       <w:proofErr w:type="spellStart"/>
       <w:r>
@@ -452,136 +846,174 @@
       </w:r>
       <w:proofErr w:type="spellStart"/>
       <w:r>
-        <w:t>directory</w:t>
-      </w:r>
-      <w:proofErr w:type="spellEnd"/>
-      <w:r>
-        <w:t xml:space="preserve"> es la carpeta del proyecto donde tengo todos los archivos y los voy </w:t>
+        <w:t>tree</w:t>
+      </w:r>
+      <w:proofErr w:type="spellEnd"/>
+      <w:r>
+        <w:t xml:space="preserve"> al contenido de esa rama.</w:t>
+      </w:r>
+    </w:p>
+    <w:p>
+      <w:pPr>
+        <w:rPr>
+          <w:color w:val="45B0E1" w:themeColor="accent1" w:themeTint="99"/>
+        </w:rPr>
+      </w:pPr>
+      <w:r>
+        <w:rPr>
+          <w:color w:val="45B0E1" w:themeColor="accent1" w:themeTint="99"/>
+        </w:rPr>
+        <w:t xml:space="preserve">5. ¿Qué diferencia hay entre crear una </w:t>
+      </w:r>
+      <w:proofErr w:type="spellStart"/>
+      <w:r>
+        <w:rPr>
+          <w:color w:val="45B0E1" w:themeColor="accent1" w:themeTint="99"/>
+        </w:rPr>
+        <w:t>branch</w:t>
+      </w:r>
+      <w:proofErr w:type="spellEnd"/>
+      <w:r>
+        <w:rPr>
+          <w:color w:val="45B0E1" w:themeColor="accent1" w:themeTint="99"/>
+        </w:rPr>
+        <w:t xml:space="preserve"> con </w:t>
+      </w:r>
+      <w:proofErr w:type="spellStart"/>
+      <w:r>
+        <w:rPr>
+          <w:color w:val="45B0E1" w:themeColor="accent1" w:themeTint="99"/>
+        </w:rPr>
+        <w:t>git</w:t>
+      </w:r>
+      <w:proofErr w:type="spellEnd"/>
+      <w:r>
+        <w:rPr>
+          <w:color w:val="45B0E1" w:themeColor="accent1" w:themeTint="99"/>
+        </w:rPr>
+        <w:t xml:space="preserve"> switch -c y crear una carpeta nueva con </w:t>
+      </w:r>
+      <w:proofErr w:type="spellStart"/>
+      <w:r>
+        <w:rPr>
+          <w:color w:val="45B0E1" w:themeColor="accent1" w:themeTint="99"/>
+        </w:rPr>
+        <w:t>mkdir</w:t>
+      </w:r>
+      <w:proofErr w:type="spellEnd"/>
+      <w:r>
+        <w:rPr>
+          <w:color w:val="45B0E1" w:themeColor="accent1" w:themeTint="99"/>
+        </w:rPr>
+        <w:t>?</w:t>
+      </w:r>
+    </w:p>
+    <w:p>
+      <w:r>
+        <w:t xml:space="preserve">Con </w:t>
+      </w:r>
+      <w:proofErr w:type="spellStart"/>
+      <w:r>
+        <w:t>git</w:t>
+      </w:r>
+      <w:proofErr w:type="spellEnd"/>
+      <w:r>
+        <w:t xml:space="preserve"> switch -c se crea</w:t>
+      </w:r>
+      <w:r>
+        <w:t xml:space="preserve"> una nueva rama y me cambia a ella, mientras que </w:t>
+      </w:r>
+      <w:proofErr w:type="spellStart"/>
+      <w:r>
+        <w:t>mkdir</w:t>
+      </w:r>
+      <w:proofErr w:type="spellEnd"/>
+      <w:r>
+        <w:t xml:space="preserve"> crea una carpeta nueva en el ordenador. </w:t>
+      </w:r>
+    </w:p>
+    <w:p>
+      <w:pPr>
+        <w:rPr>
+          <w:color w:val="45B0E1" w:themeColor="accent1" w:themeTint="99"/>
+        </w:rPr>
+      </w:pPr>
+      <w:r>
+        <w:rPr>
+          <w:color w:val="45B0E1" w:themeColor="accent1" w:themeTint="99"/>
+        </w:rPr>
+        <w:t>¿Cómo lo comprobamos en la Parte G?</w:t>
+      </w:r>
+    </w:p>
+    <w:p>
+      <w:r>
+        <w:t xml:space="preserve">Lo comprobamos ya que no apareció ninguna carpeta llamada </w:t>
+      </w:r>
+      <w:proofErr w:type="spellStart"/>
+      <w:r>
+        <w:t>feature</w:t>
+      </w:r>
+      <w:proofErr w:type="spellEnd"/>
+      <w:r>
+        <w:t>, ya que la rama existe dentro de Git, no como una carpeta.</w:t>
+      </w:r>
+    </w:p>
+    <w:p>
+      <w:pPr>
+        <w:rPr>
+          <w:color w:val="45B0E1" w:themeColor="accent1" w:themeTint="99"/>
+        </w:rPr>
+      </w:pPr>
+      <w:r>
+        <w:rPr>
+          <w:color w:val="45B0E1" w:themeColor="accent1" w:themeTint="99"/>
+        </w:rPr>
+        <w:t>6. Durante el conflicto de la Parte H, ¿qué representaba el contenido entre &lt;&lt;&lt;&lt;&lt;&lt;&lt; HEAD y =======? ¿Y</w:t>
+      </w:r>
+      <w:r>
+        <w:rPr>
+          <w:color w:val="45B0E1" w:themeColor="accent1" w:themeTint="99"/>
+        </w:rPr>
+        <w:t xml:space="preserve"> </w:t>
+      </w:r>
+      <w:r>
+        <w:rPr>
+          <w:color w:val="45B0E1" w:themeColor="accent1" w:themeTint="99"/>
+        </w:rPr>
+        <w:t>entre ======= y &gt;&gt;&gt;&gt;&gt;&gt;&gt;?</w:t>
+      </w:r>
+    </w:p>
+    <w:p>
+      <w:r>
+        <w:t xml:space="preserve">-La primera de ellas era la versión que ya tenía la rama en la que estaba, mientras que la parte de abajo era la versión de la otra rama, la que intento </w:t>
       </w:r>
       <w:proofErr w:type="gramStart"/>
       <w:r>
-        <w:t>cambiando .</w:t>
+        <w:t>fusionar .</w:t>
       </w:r>
       <w:proofErr w:type="gramEnd"/>
       <w:r>
-        <w:t xml:space="preserve"> La </w:t>
-      </w:r>
-      <w:proofErr w:type="spellStart"/>
-      <w:r>
-        <w:t>Staging</w:t>
-      </w:r>
-      <w:proofErr w:type="spellEnd"/>
-      <w:r>
-        <w:t xml:space="preserve"> </w:t>
-      </w:r>
-      <w:proofErr w:type="spellStart"/>
-      <w:r>
-        <w:t>Area</w:t>
-      </w:r>
-      <w:proofErr w:type="spellEnd"/>
-      <w:r>
-        <w:t xml:space="preserve"> es como la zona intermedia donde pongo los cambios para el próximo </w:t>
-      </w:r>
-      <w:proofErr w:type="spellStart"/>
-      <w:proofErr w:type="gramStart"/>
+        <w:t xml:space="preserve"> Borrando los </w:t>
+      </w:r>
+      <w:r>
+        <w:lastRenderedPageBreak/>
+        <w:t xml:space="preserve">símbolos, actualizando el texto y después </w:t>
+      </w:r>
+      <w:proofErr w:type="spellStart"/>
+      <w:r>
+        <w:t>haceciendo</w:t>
+      </w:r>
+      <w:proofErr w:type="spellEnd"/>
+      <w:r>
+        <w:t xml:space="preserve"> un </w:t>
+      </w:r>
+      <w:proofErr w:type="spellStart"/>
       <w:r>
         <w:t>commit</w:t>
       </w:r>
       <w:proofErr w:type="spellEnd"/>
       <w:r>
-        <w:t xml:space="preserve"> .</w:t>
-      </w:r>
-      <w:proofErr w:type="gramEnd"/>
-      <w:r>
-        <w:t xml:space="preserve"> Y la Local </w:t>
-      </w:r>
-      <w:proofErr w:type="spellStart"/>
-      <w:r>
-        <w:t>Repository</w:t>
-      </w:r>
-      <w:proofErr w:type="spellEnd"/>
-      <w:r>
-        <w:t xml:space="preserve"> es donde se guardan los </w:t>
-      </w:r>
-      <w:proofErr w:type="spellStart"/>
-      <w:r>
-        <w:t>commits</w:t>
-      </w:r>
-      <w:proofErr w:type="spellEnd"/>
-      <w:r>
-        <w:t xml:space="preserve"> ya hechos.</w:t>
-      </w:r>
-    </w:p>
-    <w:p>
-      <w:r>
-        <w:t xml:space="preserve">Por ejemplo: Modifico README.md lo que es Working </w:t>
-      </w:r>
-      <w:proofErr w:type="spellStart"/>
-      <w:r>
-        <w:t>Directory</w:t>
-      </w:r>
-      <w:proofErr w:type="spellEnd"/>
-      <w:r>
-        <w:t xml:space="preserve">, luego hago </w:t>
-      </w:r>
-      <w:proofErr w:type="gramStart"/>
-      <w:r>
-        <w:t xml:space="preserve">( </w:t>
-      </w:r>
-      <w:proofErr w:type="spellStart"/>
-      <w:r>
-        <w:t>git</w:t>
-      </w:r>
-      <w:proofErr w:type="spellEnd"/>
-      <w:proofErr w:type="gramEnd"/>
-      <w:r>
-        <w:t xml:space="preserve"> </w:t>
-      </w:r>
-      <w:proofErr w:type="spellStart"/>
-      <w:r>
-        <w:t>add</w:t>
-      </w:r>
-      <w:proofErr w:type="spellEnd"/>
-      <w:r>
-        <w:t xml:space="preserve"> README.md) y pasa al </w:t>
-      </w:r>
-      <w:proofErr w:type="spellStart"/>
-      <w:r>
-        <w:t>Sta</w:t>
-      </w:r>
-      <w:r>
-        <w:t>g</w:t>
-      </w:r>
-      <w:r>
-        <w:t>ing</w:t>
-      </w:r>
-      <w:proofErr w:type="spellEnd"/>
-      <w:r>
-        <w:t xml:space="preserve"> </w:t>
-      </w:r>
-      <w:proofErr w:type="spellStart"/>
-      <w:r>
-        <w:t>Area</w:t>
-      </w:r>
-      <w:proofErr w:type="spellEnd"/>
-      <w:r>
-        <w:t xml:space="preserve"> y por último con (</w:t>
-      </w:r>
-      <w:proofErr w:type="spellStart"/>
-      <w:r>
-        <w:t>git</w:t>
-      </w:r>
-      <w:proofErr w:type="spellEnd"/>
-      <w:r>
-        <w:t xml:space="preserve"> </w:t>
-      </w:r>
-      <w:proofErr w:type="spellStart"/>
-      <w:r>
-        <w:t>commit</w:t>
-      </w:r>
-      <w:proofErr w:type="spellEnd"/>
-      <w:r>
-        <w:t xml:space="preserve">) se guarda en el historial. </w:t>
+        <w:t>, solucionamos el conflicto.</w:t>
       </w:r>
     </w:p>
     <w:p>
@@ -594,406 +1026,6 @@
         <w:rPr>
           <w:color w:val="45B0E1" w:themeColor="accent1" w:themeTint="99"/>
         </w:rPr>
-        <w:t xml:space="preserve">2. Si modificas un </w:t>
-      </w:r>
-      <w:proofErr w:type="gramStart"/>
-      <w:r>
-        <w:rPr>
-          <w:color w:val="45B0E1" w:themeColor="accent1" w:themeTint="99"/>
-        </w:rPr>
-        <w:t>archivo</w:t>
-      </w:r>
-      <w:proofErr w:type="gramEnd"/>
-      <w:r>
-        <w:rPr>
-          <w:color w:val="45B0E1" w:themeColor="accent1" w:themeTint="99"/>
-        </w:rPr>
-        <w:t xml:space="preserve"> pero no haces </w:t>
-      </w:r>
-      <w:proofErr w:type="spellStart"/>
-      <w:r>
-        <w:rPr>
-          <w:color w:val="45B0E1" w:themeColor="accent1" w:themeTint="99"/>
-        </w:rPr>
-        <w:t>git</w:t>
-      </w:r>
-      <w:proofErr w:type="spellEnd"/>
-      <w:r>
-        <w:rPr>
-          <w:color w:val="45B0E1" w:themeColor="accent1" w:themeTint="99"/>
-        </w:rPr>
-        <w:t xml:space="preserve"> </w:t>
-      </w:r>
-      <w:proofErr w:type="spellStart"/>
-      <w:r>
-        <w:rPr>
-          <w:color w:val="45B0E1" w:themeColor="accent1" w:themeTint="99"/>
-        </w:rPr>
-        <w:t>add</w:t>
-      </w:r>
-      <w:proofErr w:type="spellEnd"/>
-      <w:r>
-        <w:rPr>
-          <w:color w:val="45B0E1" w:themeColor="accent1" w:themeTint="99"/>
-        </w:rPr>
-        <w:t xml:space="preserve">, ¿aparece ese cambio en tu próximo </w:t>
-      </w:r>
-      <w:proofErr w:type="spellStart"/>
-      <w:r>
-        <w:rPr>
-          <w:color w:val="45B0E1" w:themeColor="accent1" w:themeTint="99"/>
-        </w:rPr>
-        <w:t>commit</w:t>
-      </w:r>
-      <w:proofErr w:type="spellEnd"/>
-      <w:r>
-        <w:rPr>
-          <w:color w:val="45B0E1" w:themeColor="accent1" w:themeTint="99"/>
-        </w:rPr>
-        <w:t xml:space="preserve">? Explica </w:t>
-      </w:r>
-      <w:proofErr w:type="spellStart"/>
-      <w:r>
-        <w:rPr>
-          <w:color w:val="45B0E1" w:themeColor="accent1" w:themeTint="99"/>
-        </w:rPr>
-        <w:t>porqué</w:t>
-      </w:r>
-      <w:proofErr w:type="spellEnd"/>
-      <w:r>
-        <w:rPr>
-          <w:color w:val="45B0E1" w:themeColor="accent1" w:themeTint="99"/>
-        </w:rPr>
-        <w:t>.</w:t>
-      </w:r>
-    </w:p>
-    <w:p>
-      <w:r>
-        <w:t>No</w:t>
-      </w:r>
-      <w:r>
-        <w:t xml:space="preserve">, </w:t>
-      </w:r>
-      <w:r>
-        <w:t xml:space="preserve">sino hago </w:t>
-      </w:r>
-      <w:proofErr w:type="spellStart"/>
-      <w:r>
-        <w:t>git</w:t>
-      </w:r>
-      <w:proofErr w:type="spellEnd"/>
-      <w:r>
-        <w:t xml:space="preserve"> </w:t>
-      </w:r>
-      <w:proofErr w:type="spellStart"/>
-      <w:r>
-        <w:t>add</w:t>
-      </w:r>
-      <w:proofErr w:type="spellEnd"/>
-      <w:r>
-        <w:t>, no</w:t>
-      </w:r>
-      <w:r>
-        <w:t xml:space="preserve"> aparece en el </w:t>
-      </w:r>
-      <w:proofErr w:type="spellStart"/>
-      <w:r>
-        <w:t>commit</w:t>
-      </w:r>
-      <w:proofErr w:type="spellEnd"/>
-      <w:r>
-        <w:t xml:space="preserve">, ya </w:t>
-      </w:r>
-      <w:r>
-        <w:t xml:space="preserve">que no permitimos que pase del </w:t>
-      </w:r>
-      <w:proofErr w:type="spellStart"/>
-      <w:r>
-        <w:t>Sta</w:t>
-      </w:r>
-      <w:r>
-        <w:t>g</w:t>
-      </w:r>
-      <w:r>
-        <w:t>ing</w:t>
-      </w:r>
-      <w:proofErr w:type="spellEnd"/>
-      <w:r>
-        <w:t xml:space="preserve"> </w:t>
-      </w:r>
-      <w:proofErr w:type="spellStart"/>
-      <w:r>
-        <w:t>Area</w:t>
-      </w:r>
-      <w:proofErr w:type="spellEnd"/>
-      <w:r>
-        <w:t xml:space="preserve"> Local </w:t>
-      </w:r>
-      <w:proofErr w:type="spellStart"/>
-      <w:r>
-        <w:t>Repository</w:t>
-      </w:r>
-      <w:proofErr w:type="spellEnd"/>
-    </w:p>
-    <w:p>
-      <w:pPr>
-        <w:rPr>
-          <w:color w:val="45B0E1" w:themeColor="accent1" w:themeTint="99"/>
-        </w:rPr>
-      </w:pPr>
-      <w:r>
-        <w:rPr>
-          <w:color w:val="45B0E1" w:themeColor="accent1" w:themeTint="99"/>
-        </w:rPr>
-        <w:t xml:space="preserve">3. ¿Por qué </w:t>
-      </w:r>
-      <w:proofErr w:type="spellStart"/>
-      <w:r>
-        <w:rPr>
-          <w:color w:val="45B0E1" w:themeColor="accent1" w:themeTint="99"/>
-        </w:rPr>
-        <w:t>git</w:t>
-      </w:r>
-      <w:proofErr w:type="spellEnd"/>
-      <w:r>
-        <w:rPr>
-          <w:color w:val="45B0E1" w:themeColor="accent1" w:themeTint="99"/>
-        </w:rPr>
-        <w:t xml:space="preserve"> </w:t>
-      </w:r>
-      <w:proofErr w:type="gramStart"/>
-      <w:r>
-        <w:rPr>
-          <w:color w:val="45B0E1" w:themeColor="accent1" w:themeTint="99"/>
-        </w:rPr>
-        <w:t>status</w:t>
-      </w:r>
-      <w:proofErr w:type="gramEnd"/>
-      <w:r>
-        <w:rPr>
-          <w:color w:val="45B0E1" w:themeColor="accent1" w:themeTint="99"/>
-        </w:rPr>
-        <w:t xml:space="preserve"> no mostraba las carpetas vacías que creaste en la Parte C? ¿Qué truco usamos para</w:t>
-      </w:r>
-      <w:r>
-        <w:rPr>
-          <w:color w:val="45B0E1" w:themeColor="accent1" w:themeTint="99"/>
-        </w:rPr>
-        <w:t xml:space="preserve"> </w:t>
-      </w:r>
-      <w:r>
-        <w:rPr>
-          <w:color w:val="45B0E1" w:themeColor="accent1" w:themeTint="99"/>
-        </w:rPr>
-        <w:t>solucionarlo?</w:t>
-      </w:r>
-    </w:p>
-    <w:p>
-      <w:r>
-        <w:t xml:space="preserve">Porque </w:t>
-      </w:r>
-      <w:proofErr w:type="spellStart"/>
-      <w:r>
-        <w:t>git</w:t>
-      </w:r>
-      <w:proofErr w:type="spellEnd"/>
-      <w:r>
-        <w:t xml:space="preserve"> no guarda capetas vacías, sino archivos.  Para solucionarlo guardamos dentro de estas carpetas archivos </w:t>
-      </w:r>
-      <w:proofErr w:type="gramStart"/>
-      <w:r>
-        <w:t>llamados .</w:t>
-      </w:r>
-      <w:proofErr w:type="spellStart"/>
-      <w:r>
-        <w:t>gitkeep</w:t>
-      </w:r>
-      <w:proofErr w:type="spellEnd"/>
-      <w:proofErr w:type="gramEnd"/>
-      <w:r>
-        <w:t xml:space="preserve">, así ya se guardaba algo dentro de estas carpetas. </w:t>
-      </w:r>
-    </w:p>
-    <w:p>
-      <w:pPr>
-        <w:rPr>
-          <w:color w:val="45B0E1" w:themeColor="accent1" w:themeTint="99"/>
-        </w:rPr>
-      </w:pPr>
-      <w:r>
-        <w:rPr>
-          <w:color w:val="45B0E1" w:themeColor="accent1" w:themeTint="99"/>
-        </w:rPr>
-        <w:t>4. Explica con tus palabras qué es HEAD.</w:t>
-      </w:r>
-    </w:p>
-    <w:p>
-      <w:r>
-        <w:t xml:space="preserve">Es básicamente como una referencia que me dice en que rama me encuentro </w:t>
-      </w:r>
-      <w:proofErr w:type="gramStart"/>
-      <w:r>
-        <w:t>ahora  mismo</w:t>
-      </w:r>
-      <w:proofErr w:type="gramEnd"/>
-      <w:r>
-        <w:t xml:space="preserve">. </w:t>
-      </w:r>
-    </w:p>
-    <w:p>
-      <w:pPr>
-        <w:rPr>
-          <w:color w:val="45B0E1" w:themeColor="accent1" w:themeTint="99"/>
-        </w:rPr>
-      </w:pPr>
-      <w:r>
-        <w:rPr>
-          <w:color w:val="45B0E1" w:themeColor="accent1" w:themeTint="99"/>
-        </w:rPr>
-        <w:t xml:space="preserve">5. ¿Qué diferencia hay entre crear una </w:t>
-      </w:r>
-      <w:proofErr w:type="spellStart"/>
-      <w:r>
-        <w:rPr>
-          <w:color w:val="45B0E1" w:themeColor="accent1" w:themeTint="99"/>
-        </w:rPr>
-        <w:t>branch</w:t>
-      </w:r>
-      <w:proofErr w:type="spellEnd"/>
-      <w:r>
-        <w:rPr>
-          <w:color w:val="45B0E1" w:themeColor="accent1" w:themeTint="99"/>
-        </w:rPr>
-        <w:t xml:space="preserve"> con </w:t>
-      </w:r>
-      <w:proofErr w:type="spellStart"/>
-      <w:r>
-        <w:rPr>
-          <w:color w:val="45B0E1" w:themeColor="accent1" w:themeTint="99"/>
-        </w:rPr>
-        <w:t>git</w:t>
-      </w:r>
-      <w:proofErr w:type="spellEnd"/>
-      <w:r>
-        <w:rPr>
-          <w:color w:val="45B0E1" w:themeColor="accent1" w:themeTint="99"/>
-        </w:rPr>
-        <w:t xml:space="preserve"> switch -c y crear una carpeta nueva con </w:t>
-      </w:r>
-      <w:proofErr w:type="spellStart"/>
-      <w:r>
-        <w:rPr>
-          <w:color w:val="45B0E1" w:themeColor="accent1" w:themeTint="99"/>
-        </w:rPr>
-        <w:t>mkdir</w:t>
-      </w:r>
-      <w:proofErr w:type="spellEnd"/>
-      <w:r>
-        <w:rPr>
-          <w:color w:val="45B0E1" w:themeColor="accent1" w:themeTint="99"/>
-        </w:rPr>
-        <w:t>?</w:t>
-      </w:r>
-    </w:p>
-    <w:p>
-      <w:r>
-        <w:t xml:space="preserve">Con </w:t>
-      </w:r>
-      <w:proofErr w:type="spellStart"/>
-      <w:r>
-        <w:t>git</w:t>
-      </w:r>
-      <w:proofErr w:type="spellEnd"/>
-      <w:r>
-        <w:t xml:space="preserve"> switch -c se crea</w:t>
-      </w:r>
-      <w:r>
-        <w:t xml:space="preserve"> una nueva rama y me cambia a ella, mientras que </w:t>
-      </w:r>
-      <w:proofErr w:type="spellStart"/>
-      <w:r>
-        <w:t>mkdir</w:t>
-      </w:r>
-      <w:proofErr w:type="spellEnd"/>
-      <w:r>
-        <w:t xml:space="preserve"> crea una carpeta nueva en el ordenador. </w:t>
-      </w:r>
-    </w:p>
-    <w:p>
-      <w:pPr>
-        <w:rPr>
-          <w:color w:val="45B0E1" w:themeColor="accent1" w:themeTint="99"/>
-        </w:rPr>
-      </w:pPr>
-      <w:r>
-        <w:rPr>
-          <w:color w:val="45B0E1" w:themeColor="accent1" w:themeTint="99"/>
-        </w:rPr>
-        <w:t>¿Cómo lo comprobamos en la Parte G?</w:t>
-      </w:r>
-    </w:p>
-    <w:p>
-      <w:r>
-        <w:t xml:space="preserve">Lo comprobamos ya que no apareció ninguna carpeta llamada </w:t>
-      </w:r>
-      <w:proofErr w:type="spellStart"/>
-      <w:r>
-        <w:t>feature</w:t>
-      </w:r>
-      <w:proofErr w:type="spellEnd"/>
-      <w:r>
-        <w:t>, ya que la rama existe dentro de Git, no como una carpeta.</w:t>
-      </w:r>
-    </w:p>
-    <w:p>
-      <w:pPr>
-        <w:rPr>
-          <w:color w:val="45B0E1" w:themeColor="accent1" w:themeTint="99"/>
-        </w:rPr>
-      </w:pPr>
-      <w:r>
-        <w:rPr>
-          <w:color w:val="45B0E1" w:themeColor="accent1" w:themeTint="99"/>
-        </w:rPr>
-        <w:t>6. Durante el conflicto de la Parte H, ¿qué representaba el contenido entre &lt;&lt;&lt;&lt;&lt;&lt;&lt; HEAD y =======? ¿Y</w:t>
-      </w:r>
-      <w:r>
-        <w:rPr>
-          <w:color w:val="45B0E1" w:themeColor="accent1" w:themeTint="99"/>
-        </w:rPr>
-        <w:t xml:space="preserve"> </w:t>
-      </w:r>
-      <w:r>
-        <w:rPr>
-          <w:color w:val="45B0E1" w:themeColor="accent1" w:themeTint="99"/>
-        </w:rPr>
-        <w:t>entre ======= y &gt;&gt;&gt;&gt;&gt;&gt;&gt;?</w:t>
-      </w:r>
-    </w:p>
-    <w:p>
-      <w:r>
-        <w:t xml:space="preserve">La primera de ellas era la versión que ya tenía la rama en la que estaba, mientras que la parte de abajo era la versión de la otra rama.  Borrando los símbolos, actualizando el texto y después hacer un </w:t>
-      </w:r>
-      <w:proofErr w:type="spellStart"/>
-      <w:r>
-        <w:t>commit</w:t>
-      </w:r>
-      <w:proofErr w:type="spellEnd"/>
-      <w:r>
-        <w:t>, solucionamos el conflicto.</w:t>
-      </w:r>
-    </w:p>
-    <w:p>
-      <w:pPr>
-        <w:rPr>
-          <w:color w:val="45B0E1" w:themeColor="accent1" w:themeTint="99"/>
-        </w:rPr>
-      </w:pPr>
-      <w:r>
-        <w:rPr>
-          <w:color w:val="45B0E1" w:themeColor="accent1" w:themeTint="99"/>
-        </w:rPr>
-        <w:lastRenderedPageBreak/>
         <w:t xml:space="preserve">7. ¿Por qué NO se debe hacer </w:t>
       </w:r>
       <w:proofErr w:type="spellStart"/>
@@ -1562,6 +1594,7 @@
     </w:p>
     <w:p>
       <w:r>
+        <w:lastRenderedPageBreak/>
         <w:t>Para considerar el Laboratorio 1 completado, el repositorio en GitHub debe cumplir:</w:t>
       </w:r>
     </w:p>
@@ -1580,7 +1613,9 @@
     </w:p>
     <w:p>
       <w:r>
-        <w:lastRenderedPageBreak/>
+        <w:rPr>
+          <w:noProof/>
+        </w:rPr>
         <w:drawing>
           <wp:inline distT="0" distB="0" distL="0" distR="0" wp14:anchorId="54624E3C" wp14:editId="4B54571F">
             <wp:extent cx="5400040" cy="2582545"/>
@@ -1711,6 +1746,9 @@
     </w:p>
     <w:p>
       <w:r>
+        <w:rPr>
+          <w:noProof/>
+        </w:rPr>
         <w:drawing>
           <wp:inline distT="0" distB="0" distL="0" distR="0" wp14:anchorId="17BA6A8A" wp14:editId="59FD6C3A">
             <wp:extent cx="5400040" cy="1697990"/>
@@ -1755,6 +1793,9 @@
     </w:p>
     <w:p>
       <w:r>
+        <w:rPr>
+          <w:noProof/>
+        </w:rPr>
         <w:drawing>
           <wp:inline distT="0" distB="0" distL="0" distR="0" wp14:anchorId="32936B98" wp14:editId="5C93702C">
             <wp:extent cx="4320914" cy="1646063"/>
@@ -1977,6 +2018,9 @@
     </w:p>
     <w:p>
       <w:r>
+        <w:rPr>
+          <w:noProof/>
+        </w:rPr>
         <w:drawing>
           <wp:inline distT="0" distB="0" distL="0" distR="0" wp14:anchorId="09617263" wp14:editId="7A6E05A5">
             <wp:extent cx="4930567" cy="586791"/>
@@ -2067,6 +2111,9 @@
     </w:p>
     <w:p>
       <w:r>
+        <w:rPr>
+          <w:noProof/>
+        </w:rPr>
         <w:drawing>
           <wp:inline distT="0" distB="0" distL="0" distR="0" wp14:anchorId="2984E59D" wp14:editId="22AF2B5C">
             <wp:extent cx="5400040" cy="3110865"/>
@@ -2185,6 +2232,7 @@
         <w:bCs/>
         <w:i/>
         <w:iCs/>
+        <w:noProof/>
         <w:sz w:val="18"/>
         <w:szCs w:val="18"/>
       </w:rPr>
@@ -2875,6 +2923,7 @@
   <w:style w:type="character" w:default="1" w:styleId="Fuentedeprrafopredeter">
     <w:name w:val="Default Paragraph Font"/>
     <w:uiPriority w:val="1"/>
+    <w:semiHidden/>
     <w:unhideWhenUsed/>
   </w:style>
   <w:style w:type="table" w:default="1" w:styleId="Tablanormal">

</xml_diff>

<commit_message>
docs: update final lab report
</commit_message>
<xml_diff>
--- a/docs/ABD Práctica 1 - Laboratorio 1 - Git Fundamentals.docx
+++ b/docs/ABD Práctica 1 - Laboratorio 1 - Git Fundamentals.docx
@@ -1613,14 +1613,11 @@
     </w:p>
     <w:p>
       <w:r>
-        <w:rPr>
-          <w:noProof/>
-        </w:rPr>
         <w:drawing>
-          <wp:inline distT="0" distB="0" distL="0" distR="0" wp14:anchorId="54624E3C" wp14:editId="4B54571F">
-            <wp:extent cx="5400040" cy="2582545"/>
-            <wp:effectExtent l="0" t="0" r="0" b="8255"/>
-            <wp:docPr id="2018420191" name="Imagen 1"/>
+          <wp:inline distT="0" distB="0" distL="0" distR="0" wp14:anchorId="5BB7DC64" wp14:editId="55A7CD10">
+            <wp:extent cx="5400040" cy="2884805"/>
+            <wp:effectExtent l="0" t="0" r="0" b="0"/>
+            <wp:docPr id="1704644387" name="Imagen 1"/>
             <wp:cNvGraphicFramePr>
               <a:graphicFrameLocks xmlns:a="http://schemas.openxmlformats.org/drawingml/2006/main" noChangeAspect="1"/>
             </wp:cNvGraphicFramePr>
@@ -1628,7 +1625,7 @@
               <a:graphicData uri="http://schemas.openxmlformats.org/drawingml/2006/picture">
                 <pic:pic xmlns:pic="http://schemas.openxmlformats.org/drawingml/2006/picture">
                   <pic:nvPicPr>
-                    <pic:cNvPr id="2018420191" name=""/>
+                    <pic:cNvPr id="1704644387" name=""/>
                     <pic:cNvPicPr/>
                   </pic:nvPicPr>
                   <pic:blipFill>
@@ -1640,7 +1637,7 @@
                   <pic:spPr>
                     <a:xfrm>
                       <a:off x="0" y="0"/>
-                      <a:ext cx="5400040" cy="2582545"/>
+                      <a:ext cx="5400040" cy="2884805"/>
                     </a:xfrm>
                     <a:prstGeom prst="rect">
                       <a:avLst/>

</xml_diff>